<commit_message>
Release 03: CRUDES Agendamento e Produto + Relatorios + testes Selenium + DRE e CRO atualizados
</commit_message>
<xml_diff>
--- a/CRO_PetShop.docx
+++ b/CRO_PetShop.docx
@@ -12,9 +12,13 @@
       <w:pPr>
         <w:spacing w:after="200"/>
         <w:jc w:val="center"/>
+        <w:rPr>
+          <w:rFonts w:ascii="Lora" w:hAnsi="Lora"/>
+        </w:rPr>
       </w:pPr>
       <w:r>
         <w:rPr>
+          <w:rFonts w:ascii="Lora" w:hAnsi="Lora"/>
           <w:b/>
           <w:bCs/>
           <w:color w:val="2E75B6"/>
@@ -28,9 +32,13 @@
       <w:pPr>
         <w:spacing w:after="400"/>
         <w:jc w:val="center"/>
+        <w:rPr>
+          <w:rFonts w:ascii="Lora" w:hAnsi="Lora"/>
+        </w:rPr>
       </w:pPr>
       <w:r>
         <w:rPr>
+          <w:rFonts w:ascii="Lora" w:hAnsi="Lora"/>
           <w:color w:val="404040"/>
           <w:sz w:val="32"/>
           <w:szCs w:val="32"/>
@@ -38,8 +46,20 @@
         <w:t>Sistema de Gerenciamento de Pet Shop</w:t>
       </w:r>
     </w:p>
-    <w:p/>
-    <w:p/>
+    <w:p>
+      <w:pPr>
+        <w:rPr>
+          <w:rFonts w:ascii="Lora" w:hAnsi="Lora"/>
+        </w:rPr>
+      </w:pPr>
+    </w:p>
+    <w:p>
+      <w:pPr>
+        <w:rPr>
+          <w:rFonts w:ascii="Lora" w:hAnsi="Lora"/>
+        </w:rPr>
+      </w:pPr>
+    </w:p>
     <w:tbl>
       <w:tblPr>
         <w:tblW w:w="9360" w:type="dxa"/>
@@ -84,10 +104,20 @@
             </w:tcMar>
           </w:tcPr>
           <w:p>
+            <w:pPr>
+              <w:rPr>
+                <w:rFonts w:ascii="Lora" w:hAnsi="Lora"/>
+                <w:sz w:val="24"/>
+                <w:szCs w:val="24"/>
+              </w:rPr>
+            </w:pPr>
             <w:r>
               <w:rPr>
+                <w:rFonts w:ascii="Lora" w:hAnsi="Lora"/>
                 <w:b/>
                 <w:bCs/>
+                <w:sz w:val="24"/>
+                <w:szCs w:val="24"/>
               </w:rPr>
               <w:t>Disciplina</w:t>
             </w:r>
@@ -110,7 +140,19 @@
             </w:tcMar>
           </w:tcPr>
           <w:p>
+            <w:pPr>
+              <w:rPr>
+                <w:rFonts w:ascii="Lora" w:hAnsi="Lora"/>
+                <w:sz w:val="24"/>
+                <w:szCs w:val="24"/>
+              </w:rPr>
+            </w:pPr>
             <w:r>
+              <w:rPr>
+                <w:rFonts w:ascii="Lora" w:hAnsi="Lora"/>
+                <w:sz w:val="24"/>
+                <w:szCs w:val="24"/>
+              </w:rPr>
               <w:t>Engenharia de Software I</w:t>
             </w:r>
           </w:p>
@@ -138,10 +180,20 @@
             </w:tcMar>
           </w:tcPr>
           <w:p>
+            <w:pPr>
+              <w:rPr>
+                <w:rFonts w:ascii="Lora" w:hAnsi="Lora"/>
+                <w:sz w:val="24"/>
+                <w:szCs w:val="24"/>
+              </w:rPr>
+            </w:pPr>
             <w:r>
               <w:rPr>
+                <w:rFonts w:ascii="Lora" w:hAnsi="Lora"/>
                 <w:b/>
                 <w:bCs/>
+                <w:sz w:val="24"/>
+                <w:szCs w:val="24"/>
               </w:rPr>
               <w:t>Projeto</w:t>
             </w:r>
@@ -164,7 +216,19 @@
             </w:tcMar>
           </w:tcPr>
           <w:p>
+            <w:pPr>
+              <w:rPr>
+                <w:rFonts w:ascii="Lora" w:hAnsi="Lora"/>
+                <w:sz w:val="24"/>
+                <w:szCs w:val="24"/>
+              </w:rPr>
+            </w:pPr>
             <w:r>
+              <w:rPr>
+                <w:rFonts w:ascii="Lora" w:hAnsi="Lora"/>
+                <w:sz w:val="24"/>
+                <w:szCs w:val="24"/>
+              </w:rPr>
               <w:t>Sistema Pet Shop</w:t>
             </w:r>
           </w:p>
@@ -192,10 +256,20 @@
             </w:tcMar>
           </w:tcPr>
           <w:p>
+            <w:pPr>
+              <w:rPr>
+                <w:rFonts w:ascii="Lora" w:hAnsi="Lora"/>
+                <w:sz w:val="24"/>
+                <w:szCs w:val="24"/>
+              </w:rPr>
+            </w:pPr>
             <w:r>
               <w:rPr>
+                <w:rFonts w:ascii="Lora" w:hAnsi="Lora"/>
                 <w:b/>
                 <w:bCs/>
+                <w:sz w:val="24"/>
+                <w:szCs w:val="24"/>
               </w:rPr>
               <w:t>Versão</w:t>
             </w:r>
@@ -218,11 +292,20 @@
             </w:tcMar>
           </w:tcPr>
           <w:p>
+            <w:pPr>
+              <w:rPr>
+                <w:rFonts w:ascii="Lora" w:hAnsi="Lora"/>
+                <w:sz w:val="24"/>
+                <w:szCs w:val="24"/>
+              </w:rPr>
+            </w:pPr>
             <w:r>
-              <w:t>1.</w:t>
-            </w:r>
-            <w:r>
-              <w:t>1</w:t>
+              <w:rPr>
+                <w:rFonts w:ascii="Lora" w:hAnsi="Lora"/>
+                <w:sz w:val="24"/>
+                <w:szCs w:val="24"/>
+              </w:rPr>
+              <w:t>3.0</w:t>
             </w:r>
           </w:p>
         </w:tc>
@@ -249,10 +332,20 @@
             </w:tcMar>
           </w:tcPr>
           <w:p>
+            <w:pPr>
+              <w:rPr>
+                <w:rFonts w:ascii="Lora" w:hAnsi="Lora"/>
+                <w:sz w:val="24"/>
+                <w:szCs w:val="24"/>
+              </w:rPr>
+            </w:pPr>
             <w:r>
               <w:rPr>
+                <w:rFonts w:ascii="Lora" w:hAnsi="Lora"/>
                 <w:b/>
                 <w:bCs/>
+                <w:sz w:val="24"/>
+                <w:szCs w:val="24"/>
               </w:rPr>
               <w:t>Data</w:t>
             </w:r>
@@ -275,24 +368,43 @@
             </w:tcMar>
           </w:tcPr>
           <w:p>
+            <w:pPr>
+              <w:rPr>
+                <w:rFonts w:ascii="Lora" w:hAnsi="Lora"/>
+                <w:sz w:val="24"/>
+                <w:szCs w:val="24"/>
+              </w:rPr>
+            </w:pPr>
             <w:r>
-              <w:t>08</w:t>
+              <w:rPr>
+                <w:rFonts w:ascii="Lora" w:hAnsi="Lora"/>
+                <w:sz w:val="24"/>
+                <w:szCs w:val="24"/>
+              </w:rPr>
+              <w:t>15</w:t>
             </w:r>
             <w:r>
-              <w:t>/0</w:t>
-            </w:r>
-            <w:r>
-              <w:t>6</w:t>
-            </w:r>
-            <w:r>
-              <w:t>/2026</w:t>
+              <w:rPr>
+                <w:rFonts w:ascii="Lora" w:hAnsi="Lora"/>
+                <w:sz w:val="24"/>
+                <w:szCs w:val="24"/>
+              </w:rPr>
+              <w:t>/06/2026</w:t>
             </w:r>
           </w:p>
         </w:tc>
       </w:tr>
     </w:tbl>
     <w:p>
+      <w:pPr>
+        <w:rPr>
+          <w:rFonts w:ascii="Lora" w:hAnsi="Lora"/>
+        </w:rPr>
+      </w:pPr>
       <w:r>
+        <w:rPr>
+          <w:rFonts w:ascii="Lora" w:hAnsi="Lora"/>
+        </w:rPr>
         <w:br w:type="page"/>
       </w:r>
     </w:p>
@@ -300,13 +412,17 @@
       <w:pPr>
         <w:jc w:val="center"/>
       </w:pPr>
+    </w:p>
+    <w:p>
+      <w:pPr>
+        <w:jc w:val="center"/>
+      </w:pPr>
       <w:r>
-        <w:lastRenderedPageBreak/>
         <w:drawing>
-          <wp:inline distT="0" distB="0" distL="0" distR="0" wp14:anchorId="0DE40A98" wp14:editId="230C2F3E">
-            <wp:extent cx="8467725" cy="4681897"/>
-            <wp:effectExtent l="0" t="0" r="0" b="4445"/>
-            <wp:docPr id="290641794" name="Imagem 1"/>
+          <wp:inline distT="0" distB="0" distL="0" distR="0" wp14:anchorId="483E38DF" wp14:editId="366AC8A7">
+            <wp:extent cx="8863330" cy="4482465"/>
+            <wp:effectExtent l="0" t="0" r="0" b="0"/>
+            <wp:docPr id="1760605501" name="Imagem 1"/>
             <wp:cNvGraphicFramePr>
               <a:graphicFrameLocks xmlns:a="http://schemas.openxmlformats.org/drawingml/2006/main" noChangeAspect="1"/>
             </wp:cNvGraphicFramePr>
@@ -314,30 +430,23 @@
               <a:graphicData uri="http://schemas.openxmlformats.org/drawingml/2006/picture">
                 <pic:pic xmlns:pic="http://schemas.openxmlformats.org/drawingml/2006/picture">
                   <pic:nvPicPr>
-                    <pic:cNvPr id="290641794" name=""/>
+                    <pic:cNvPr id="1760605501" name=""/>
                     <pic:cNvPicPr/>
                   </pic:nvPicPr>
-                  <pic:blipFill rotWithShape="1">
+                  <pic:blipFill>
                     <a:blip r:embed="rId7"/>
-                    <a:srcRect r="16332"/>
-                    <a:stretch/>
+                    <a:stretch>
+                      <a:fillRect/>
+                    </a:stretch>
                   </pic:blipFill>
-                  <pic:spPr bwMode="auto">
+                  <pic:spPr>
                     <a:xfrm>
                       <a:off x="0" y="0"/>
-                      <a:ext cx="8496119" cy="4697596"/>
+                      <a:ext cx="8863330" cy="4482465"/>
                     </a:xfrm>
                     <a:prstGeom prst="rect">
                       <a:avLst/>
                     </a:prstGeom>
-                    <a:ln>
-                      <a:noFill/>
-                    </a:ln>
-                    <a:extLst>
-                      <a:ext uri="{53640926-AAD7-44D8-BBD7-CCE9431645EC}">
-                        <a14:shadowObscured xmlns:a14="http://schemas.microsoft.com/office/drawing/2010/main"/>
-                      </a:ext>
-                    </a:extLst>
                   </pic:spPr>
                 </pic:pic>
               </a:graphicData>

</xml_diff>